<commit_message>
U2.1 Plan Maestro Cuidarte+ completo (secc 1-6 y 8, lenguaje simple)
</commit_message>
<xml_diff>
--- a/Mis_Entregables/U2.1_Plan_Maestro/Plan_Maestro_Seccion7_Cuidarte.docx
+++ b/Mis_Entregables/U2.1_Plan_Maestro/Plan_Maestro_Seccion7_Cuidarte.docx
@@ -184,16 +184,8 @@
             </w:tcBorders>
           </w:tcPr>
           <w:p>
-            <w:pPr>
-              <w:spacing w:after="0"/>
-            </w:pPr>
             <w:r>
-              <w:rPr>
-                <w:rFonts w:ascii="Arial" w:hAnsi="Arial"/>
-                <w:color w:val="000000"/>
-                <w:sz w:val="18"/>
-              </w:rPr>
-              <w:t>[Completar]</w:t>
+              <w:t>Grupo 1</w:t>
             </w:r>
           </w:p>
         </w:tc>
@@ -217,16 +209,8 @@
             </w:tcBorders>
           </w:tcPr>
           <w:p>
-            <w:pPr>
-              <w:spacing w:after="0"/>
-            </w:pPr>
             <w:r>
-              <w:rPr>
-                <w:rFonts w:ascii="Arial" w:hAnsi="Arial"/>
-                <w:color w:val="000000"/>
-                <w:sz w:val="18"/>
-              </w:rPr>
-              <w:t>[Completar nombres y sección]</w:t>
+              <w:t>Benjamin Ibanez - Gerardo Vera</w:t>
             </w:r>
           </w:p>
         </w:tc>
@@ -250,16 +234,8 @@
             </w:tcBorders>
           </w:tcPr>
           <w:p>
-            <w:pPr>
-              <w:spacing w:after="0"/>
-            </w:pPr>
             <w:r>
-              <w:rPr>
-                <w:rFonts w:ascii="Arial" w:hAnsi="Arial"/>
-                <w:color w:val="000000"/>
-                <w:sz w:val="18"/>
-              </w:rPr>
-              <w:t>[Atlas / Cuidarte+ / otro autorizado]</w:t>
+              <w:t>Cuidarte+ (Caso B)</w:t>
             </w:r>
           </w:p>
         </w:tc>
@@ -386,16 +362,8 @@
             </w:tcBorders>
           </w:tcPr>
           <w:p>
-            <w:pPr>
-              <w:spacing w:after="0"/>
-            </w:pPr>
             <w:r>
-              <w:rPr>
-                <w:rFonts w:ascii="Arial" w:hAnsi="Arial"/>
-                <w:color w:val="000000"/>
-                <w:sz w:val="18"/>
-              </w:rPr>
-              <w:t>[Completar]</w:t>
+              <w:t>06-10-2026</w:t>
             </w:r>
           </w:p>
         </w:tc>
@@ -419,16 +387,8 @@
             </w:tcBorders>
           </w:tcPr>
           <w:p>
-            <w:pPr>
-              <w:spacing w:after="0"/>
-            </w:pPr>
             <w:r>
-              <w:rPr>
-                <w:rFonts w:ascii="Arial" w:hAnsi="Arial"/>
-                <w:color w:val="000000"/>
-                <w:sz w:val="18"/>
-              </w:rPr>
-              <w:t>[Completar]</w:t>
+              <w:t>github.com/beibanezv/cuidarte-plus-calidad-seguridad-isy1102</w:t>
             </w:r>
           </w:p>
         </w:tc>
@@ -452,16 +412,8 @@
             </w:tcBorders>
           </w:tcPr>
           <w:p>
-            <w:pPr>
-              <w:spacing w:after="0"/>
-            </w:pPr>
             <w:r>
-              <w:rPr>
-                <w:rFonts w:ascii="Arial" w:hAnsi="Arial"/>
-                <w:color w:val="000000"/>
-                <w:sz w:val="18"/>
-              </w:rPr>
-              <w:t>[Completar]</w:t>
+              <w:t>Benjamin Ibanez</w:t>
             </w:r>
           </w:p>
         </w:tc>
@@ -665,16 +617,8 @@
             </w:tcBorders>
           </w:tcPr>
           <w:p>
-            <w:pPr>
-              <w:spacing w:after="0"/>
-            </w:pPr>
             <w:r>
-              <w:rPr>
-                <w:rFonts w:ascii="Arial" w:hAnsi="Arial"/>
-                <w:color w:val="000000"/>
-                <w:sz w:val="18"/>
-              </w:rPr>
-              <w:t>[Qué problema resuelve y quién lo utiliza]</w:t>
+              <w:t>Cuidarte+ es una app para centros de salud. Sirve para registrar pacientes y examenes. La usan medicos, pacientes y el admin.</w:t>
             </w:r>
           </w:p>
         </w:tc>
@@ -698,16 +642,8 @@
             </w:tcBorders>
           </w:tcPr>
           <w:p>
-            <w:pPr>
-              <w:spacing w:after="0"/>
-            </w:pPr>
             <w:r>
-              <w:rPr>
-                <w:rFonts w:ascii="Arial" w:hAnsi="Arial"/>
-                <w:color w:val="000000"/>
-                <w:sz w:val="18"/>
-              </w:rPr>
-              <w:t>[README, interfaz o explicación del caso]</w:t>
+              <w:t>README + ERS_B</w:t>
             </w:r>
           </w:p>
         </w:tc>
@@ -766,16 +702,8 @@
             </w:tcBorders>
           </w:tcPr>
           <w:p>
-            <w:pPr>
-              <w:spacing w:after="0"/>
-            </w:pPr>
             <w:r>
-              <w:rPr>
-                <w:rFonts w:ascii="Arial" w:hAnsi="Arial"/>
-                <w:color w:val="000000"/>
-                <w:sz w:val="18"/>
-              </w:rPr>
-              <w:t>[Tecnología, dirección local y pantallas principales]</w:t>
+              <w:t>Frontend en React con Vite. Corre en http://localhost:3333. Pantallas: login, pacientes (lista y crear), examenes y auditoria.</w:t>
             </w:r>
           </w:p>
         </w:tc>
@@ -799,16 +727,8 @@
             </w:tcBorders>
           </w:tcPr>
           <w:p>
-            <w:pPr>
-              <w:spacing w:after="0"/>
-            </w:pPr>
             <w:r>
-              <w:rPr>
-                <w:rFonts w:ascii="Arial" w:hAnsi="Arial"/>
-                <w:color w:val="000000"/>
-                <w:sz w:val="18"/>
-              </w:rPr>
-              <w:t>[Carpeta o URL local]</w:t>
+              <w:t>FRONTEND/src/pages + Docker</w:t>
             </w:r>
           </w:p>
         </w:tc>
@@ -867,16 +787,8 @@
             </w:tcBorders>
           </w:tcPr>
           <w:p>
-            <w:pPr>
-              <w:spacing w:after="0"/>
-            </w:pPr>
             <w:r>
-              <w:rPr>
-                <w:rFonts w:ascii="Arial" w:hAnsi="Arial"/>
-                <w:color w:val="000000"/>
-                <w:sz w:val="18"/>
-              </w:rPr>
-              <w:t>[Tecnología, servicios, endpoints relevantes]</w:t>
+              <w:t>Backend en Node con Express. Corre en http://localhost:4444 y se documenta en /docs (Swagger). Endpoints: /autenticacion, /pacientes, /examenes, /documentos, /auditoria, /roles.</w:t>
             </w:r>
           </w:p>
         </w:tc>
@@ -900,16 +812,8 @@
             </w:tcBorders>
           </w:tcPr>
           <w:p>
-            <w:pPr>
-              <w:spacing w:after="0"/>
-            </w:pPr>
             <w:r>
-              <w:rPr>
-                <w:rFonts w:ascii="Arial" w:hAnsi="Arial"/>
-                <w:color w:val="000000"/>
-                <w:sz w:val="18"/>
-              </w:rPr>
-              <w:t>[Carpeta o Swagger]</w:t>
+              <w:t>BACKEND/src/app.js + /docs</w:t>
             </w:r>
           </w:p>
         </w:tc>
@@ -968,16 +872,8 @@
             </w:tcBorders>
           </w:tcPr>
           <w:p>
-            <w:pPr>
-              <w:spacing w:after="0"/>
-            </w:pPr>
             <w:r>
-              <w:rPr>
-                <w:rFonts w:ascii="Arial" w:hAnsi="Arial"/>
-                <w:color w:val="000000"/>
-                <w:sz w:val="18"/>
-              </w:rPr>
-              <w:t>[Motor, información que almacena]</w:t>
+              <w:t>Postgres 15 en Docker (puerto 15442, base cuidarteplus). Guarda usuarios, pacientes, examenes y auditoria.</w:t>
             </w:r>
           </w:p>
         </w:tc>
@@ -1001,16 +897,8 @@
             </w:tcBorders>
           </w:tcPr>
           <w:p>
-            <w:pPr>
-              <w:spacing w:after="0"/>
-            </w:pPr>
             <w:r>
-              <w:rPr>
-                <w:rFonts w:ascii="Arial" w:hAnsi="Arial"/>
-                <w:color w:val="000000"/>
-                <w:sz w:val="18"/>
-              </w:rPr>
-              <w:t>[Servicio Docker o configuración]</w:t>
+              <w:t>docker-compose.yml + BACKEND/sql</w:t>
             </w:r>
           </w:p>
         </w:tc>
@@ -1069,16 +957,8 @@
             </w:tcBorders>
           </w:tcPr>
           <w:p>
-            <w:pPr>
-              <w:spacing w:after="0"/>
-            </w:pPr>
             <w:r>
-              <w:rPr>
-                <w:rFonts w:ascii="Arial" w:hAnsi="Arial"/>
-                <w:color w:val="000000"/>
-                <w:sz w:val="18"/>
-              </w:rPr>
-              <w:t>[Roles identificados y permisos esperados]</w:t>
+              <w:t>admin: puede todo. medico: crea y ve pacientes y examenes. paciente: solo ve sus datos. Probado: sin token da 401 y paciente creando da 403.</w:t>
             </w:r>
           </w:p>
         </w:tc>
@@ -1102,16 +982,8 @@
             </w:tcBorders>
           </w:tcPr>
           <w:p>
-            <w:pPr>
-              <w:spacing w:after="0"/>
-            </w:pPr>
             <w:r>
-              <w:rPr>
-                <w:rFonts w:ascii="Arial" w:hAnsi="Arial"/>
-                <w:color w:val="000000"/>
-                <w:sz w:val="18"/>
-              </w:rPr>
-              <w:t>[Pantallas, requisitos o código]</w:t>
+              <w:t>BACKEND/src/routes/pacientes.js + auth.js</w:t>
             </w:r>
           </w:p>
         </w:tc>
@@ -1170,16 +1042,8 @@
             </w:tcBorders>
           </w:tcPr>
           <w:p>
-            <w:pPr>
-              <w:spacing w:after="0"/>
-            </w:pPr>
             <w:r>
-              <w:rPr>
-                <w:rFonts w:ascii="Arial" w:hAnsi="Arial"/>
-                <w:color w:val="000000"/>
-                <w:sz w:val="18"/>
-              </w:rPr>
-              <w:t>[Datos personales, financieros o de salud]</w:t>
+              <w:t>RUT, nombre, email, fecha de nacimiento, sexo y datos de salud (alergias, enfermedades, grupo sanguineo). Son datos sensibles segun Ley 19.628.</w:t>
             </w:r>
           </w:p>
         </w:tc>
@@ -1203,16 +1067,8 @@
             </w:tcBorders>
           </w:tcPr>
           <w:p>
-            <w:pPr>
-              <w:spacing w:after="0"/>
-            </w:pPr>
             <w:r>
-              <w:rPr>
-                <w:rFonts w:ascii="Arial" w:hAnsi="Arial"/>
-                <w:color w:val="000000"/>
-                <w:sz w:val="18"/>
-              </w:rPr>
-              <w:t>[Justificación]</w:t>
+              <w:t>ERS_B + validations/pacientes.js</w:t>
             </w:r>
           </w:p>
         </w:tc>
@@ -1380,16 +1236,8 @@
             </w:tcBorders>
           </w:tcPr>
           <w:p>
-            <w:pPr>
-              <w:spacing w:after="0"/>
-            </w:pPr>
             <w:r>
-              <w:rPr>
-                <w:rFonts w:ascii="Arial" w:hAnsi="Arial"/>
-                <w:color w:val="000000"/>
-                <w:sz w:val="18"/>
-              </w:rPr>
-              <w:t>[Ejemplo: verificar que el sistema permita realizar operaciones críticas de forma segura, confiable y conforme a los requisitos aplicables.]</w:t>
+              <w:t>Verificar que el registro de pacientes solo guarde datos validos y que solo medico y admin puedan crear, cuidando los datos de salud (calidad + seguridad).</w:t>
             </w:r>
           </w:p>
         </w:tc>
@@ -1448,16 +1296,8 @@
             </w:tcBorders>
           </w:tcPr>
           <w:p>
-            <w:pPr>
-              <w:spacing w:after="0"/>
-            </w:pPr>
             <w:r>
-              <w:rPr>
-                <w:rFonts w:ascii="Arial" w:hAnsi="Arial"/>
-                <w:color w:val="000000"/>
-                <w:sz w:val="18"/>
-              </w:rPr>
-              <w:t>[Módulos, flujos, usuarios, integraciones y tipos de prueba que sí serán abordados.]</w:t>
+              <w:t>Modulo pacientes (POST /pacientes y lista), login con token, control por rol, validaciones de formato y auditoria. Pruebas funcionales, de seguridad basica y usabilidad del formulario.</w:t>
             </w:r>
           </w:p>
         </w:tc>
@@ -1516,16 +1356,8 @@
             </w:tcBorders>
           </w:tcPr>
           <w:p>
-            <w:pPr>
-              <w:spacing w:after="0"/>
-            </w:pPr>
             <w:r>
-              <w:rPr>
-                <w:rFonts w:ascii="Arial" w:hAnsi="Arial"/>
-                <w:color w:val="000000"/>
-                <w:sz w:val="18"/>
-              </w:rPr>
-              <w:t>[Elementos fuera del alcance y motivo.]</w:t>
+              <w:t>Carga masiva, pagos, arreglar codigo y pase a produccion. Se deja fuera porque esta etapa es solo diseno y prueba manual en local.</w:t>
             </w:r>
           </w:p>
         </w:tc>
@@ -1584,16 +1416,8 @@
             </w:tcBorders>
           </w:tcPr>
           <w:p>
-            <w:pPr>
-              <w:spacing w:after="0"/>
-            </w:pPr>
             <w:r>
-              <w:rPr>
-                <w:rFonts w:ascii="Arial" w:hAnsi="Arial"/>
-                <w:color w:val="000000"/>
-                <w:sz w:val="18"/>
-              </w:rPr>
-              <w:t>[Qué condición debe cumplirse para recomendar avanzar a producción.]</w:t>
+              <w:t>Los 5 casos iniciales dan el resultado esperado: datos buenos se guardan (201) y datos malos o sin permiso se rechazan (400/401/403) sin guardar nada.</w:t>
             </w:r>
           </w:p>
         </w:tc>
@@ -1836,16 +1660,8 @@
             </w:tcBorders>
           </w:tcPr>
           <w:p>
-            <w:pPr>
-              <w:spacing w:after="0"/>
-            </w:pPr>
             <w:r>
-              <w:rPr>
-                <w:rFonts w:ascii="Arial" w:hAnsi="Arial"/>
-                <w:color w:val="000000"/>
-                <w:sz w:val="18"/>
-              </w:rPr>
-              <w:t>RQ 01</w:t>
+              <w:t>RQ-01</w:t>
             </w:r>
           </w:p>
         </w:tc>
@@ -1869,16 +1685,8 @@
             </w:tcBorders>
           </w:tcPr>
           <w:p>
-            <w:pPr>
-              <w:spacing w:after="0"/>
-            </w:pPr>
             <w:r>
-              <w:rPr>
-                <w:rFonts w:ascii="Arial" w:hAnsi="Arial"/>
-                <w:color w:val="000000"/>
-                <w:sz w:val="18"/>
-              </w:rPr>
-              <w:t>[Completar]</w:t>
+              <w:t>Registrar paciente con datos validos (RUT, nombre 2-50, email, fecha no futura, sexo M/F/O)</w:t>
             </w:r>
           </w:p>
         </w:tc>
@@ -1902,16 +1710,8 @@
             </w:tcBorders>
           </w:tcPr>
           <w:p>
-            <w:pPr>
-              <w:spacing w:after="0"/>
-            </w:pPr>
             <w:r>
-              <w:rPr>
-                <w:rFonts w:ascii="Arial" w:hAnsi="Arial"/>
-                <w:color w:val="000000"/>
-                <w:sz w:val="18"/>
-              </w:rPr>
-              <w:t>[Funcional / no funcional]</w:t>
+              <w:t>Funcional</w:t>
             </w:r>
           </w:p>
         </w:tc>
@@ -1935,16 +1735,8 @@
             </w:tcBorders>
           </w:tcPr>
           <w:p>
-            <w:pPr>
-              <w:spacing w:after="0"/>
-            </w:pPr>
             <w:r>
-              <w:rPr>
-                <w:rFonts w:ascii="Arial" w:hAnsi="Arial"/>
-                <w:color w:val="000000"/>
-                <w:sz w:val="18"/>
-              </w:rPr>
-              <w:t>[Ejemplo: respuesta menor a 2 segundos bajo carga definida]</w:t>
+              <w:t>Da 201, aparece en la lista y deja auditoria PACIENTES_CREAR. Atributo ISO 25010: correccion funcional.</w:t>
             </w:r>
           </w:p>
         </w:tc>
@@ -1968,16 +1760,8 @@
             </w:tcBorders>
           </w:tcPr>
           <w:p>
-            <w:pPr>
-              <w:spacing w:after="0"/>
-            </w:pPr>
             <w:r>
-              <w:rPr>
-                <w:rFonts w:ascii="Arial" w:hAnsi="Arial"/>
-                <w:color w:val="000000"/>
-                <w:sz w:val="18"/>
-              </w:rPr>
-              <w:t>[Caso, ERS o código]</w:t>
+              <w:t>ERS RF-2 + BACKEND validations/pacientes.js</w:t>
             </w:r>
           </w:p>
         </w:tc>
@@ -2003,16 +1787,8 @@
             </w:tcBorders>
           </w:tcPr>
           <w:p>
-            <w:pPr>
-              <w:spacing w:after="0"/>
-            </w:pPr>
             <w:r>
-              <w:rPr>
-                <w:rFonts w:ascii="Arial" w:hAnsi="Arial"/>
-                <w:color w:val="000000"/>
-                <w:sz w:val="18"/>
-              </w:rPr>
-              <w:t>RQ 02</w:t>
+              <w:t>RQ-02</w:t>
             </w:r>
           </w:p>
         </w:tc>
@@ -2036,16 +1812,8 @@
             </w:tcBorders>
           </w:tcPr>
           <w:p>
-            <w:pPr>
-              <w:spacing w:after="0"/>
-            </w:pPr>
             <w:r>
-              <w:rPr>
-                <w:rFonts w:ascii="Arial" w:hAnsi="Arial"/>
-                <w:color w:val="000000"/>
-                <w:sz w:val="18"/>
-              </w:rPr>
-              <w:t>[Completar]</w:t>
+              <w:t>Rechazar datos invalidos (RUT 1234, email sin @, nombre de 1 o 51 letras, fecha futura, sexo X)</w:t>
             </w:r>
           </w:p>
         </w:tc>
@@ -2069,16 +1837,8 @@
             </w:tcBorders>
           </w:tcPr>
           <w:p>
-            <w:pPr>
-              <w:spacing w:after="0"/>
-            </w:pPr>
             <w:r>
-              <w:rPr>
-                <w:rFonts w:ascii="Arial" w:hAnsi="Arial"/>
-                <w:color w:val="000000"/>
-                <w:sz w:val="18"/>
-              </w:rPr>
-              <w:t>[Funcional / no funcional]</w:t>
+              <w:t>Funcional</w:t>
             </w:r>
           </w:p>
         </w:tc>
@@ -2102,16 +1862,8 @@
             </w:tcBorders>
           </w:tcPr>
           <w:p>
-            <w:pPr>
-              <w:spacing w:after="0"/>
-            </w:pPr>
             <w:r>
-              <w:rPr>
-                <w:rFonts w:ascii="Arial" w:hAnsi="Arial"/>
-                <w:color w:val="000000"/>
-                <w:sz w:val="18"/>
-              </w:rPr>
-              <w:t>[Completar]</w:t>
+              <w:t>Da 400 con mensaje claro y no guarda. ISO: fiabilidad.</w:t>
             </w:r>
           </w:p>
         </w:tc>
@@ -2135,16 +1887,8 @@
             </w:tcBorders>
           </w:tcPr>
           <w:p>
-            <w:pPr>
-              <w:spacing w:after="0"/>
-            </w:pPr>
             <w:r>
-              <w:rPr>
-                <w:rFonts w:ascii="Arial" w:hAnsi="Arial"/>
-                <w:color w:val="000000"/>
-                <w:sz w:val="18"/>
-              </w:rPr>
-              <w:t>[Completar]</w:t>
+              <w:t>Guia 2.2 + validaciones yup</w:t>
             </w:r>
           </w:p>
         </w:tc>
@@ -2170,16 +1914,8 @@
             </w:tcBorders>
           </w:tcPr>
           <w:p>
-            <w:pPr>
-              <w:spacing w:after="0"/>
-            </w:pPr>
             <w:r>
-              <w:rPr>
-                <w:rFonts w:ascii="Arial" w:hAnsi="Arial"/>
-                <w:color w:val="000000"/>
-                <w:sz w:val="18"/>
-              </w:rPr>
-              <w:t>RQ 03</w:t>
+              <w:t>RQ-03</w:t>
             </w:r>
           </w:p>
         </w:tc>
@@ -2203,16 +1939,8 @@
             </w:tcBorders>
           </w:tcPr>
           <w:p>
-            <w:pPr>
-              <w:spacing w:after="0"/>
-            </w:pPr>
             <w:r>
-              <w:rPr>
-                <w:rFonts w:ascii="Arial" w:hAnsi="Arial"/>
-                <w:color w:val="000000"/>
-                <w:sz w:val="18"/>
-              </w:rPr>
-              <w:t>[Completar]</w:t>
+              <w:t>Control de acceso: solo medico y admin crean pacientes</w:t>
             </w:r>
           </w:p>
         </w:tc>
@@ -2236,16 +1964,8 @@
             </w:tcBorders>
           </w:tcPr>
           <w:p>
-            <w:pPr>
-              <w:spacing w:after="0"/>
-            </w:pPr>
             <w:r>
-              <w:rPr>
-                <w:rFonts w:ascii="Arial" w:hAnsi="Arial"/>
-                <w:color w:val="000000"/>
-                <w:sz w:val="18"/>
-              </w:rPr>
-              <w:t>[Funcional / no funcional]</w:t>
+              <w:t>No funcional / seguridad</w:t>
             </w:r>
           </w:p>
         </w:tc>
@@ -2269,16 +1989,8 @@
             </w:tcBorders>
           </w:tcPr>
           <w:p>
-            <w:pPr>
-              <w:spacing w:after="0"/>
-            </w:pPr>
             <w:r>
-              <w:rPr>
-                <w:rFonts w:ascii="Arial" w:hAnsi="Arial"/>
-                <w:color w:val="000000"/>
-                <w:sz w:val="18"/>
-              </w:rPr>
-              <w:t>[Completar]</w:t>
+              <w:t>Paciente recibe 403 y sin token 401, no guarda. ISO: seguridad (confidencialidad).</w:t>
             </w:r>
           </w:p>
         </w:tc>
@@ -2302,16 +2014,8 @@
             </w:tcBorders>
           </w:tcPr>
           <w:p>
-            <w:pPr>
-              <w:spacing w:after="0"/>
-            </w:pPr>
             <w:r>
-              <w:rPr>
-                <w:rFonts w:ascii="Arial" w:hAnsi="Arial"/>
-                <w:color w:val="000000"/>
-                <w:sz w:val="18"/>
-              </w:rPr>
-              <w:t>[Completar]</w:t>
+              <w:t>ERS NFR-SEG-4 + RB-1/RB-2 + routes/pacientes.js</w:t>
             </w:r>
           </w:p>
         </w:tc>
@@ -2337,16 +2041,8 @@
             </w:tcBorders>
           </w:tcPr>
           <w:p>
-            <w:pPr>
-              <w:spacing w:after="0"/>
-            </w:pPr>
             <w:r>
-              <w:rPr>
-                <w:rFonts w:ascii="Arial" w:hAnsi="Arial"/>
-                <w:color w:val="000000"/>
-                <w:sz w:val="18"/>
-              </w:rPr>
-              <w:t>RQ 04</w:t>
+              <w:t>RQ-04</w:t>
             </w:r>
           </w:p>
         </w:tc>
@@ -2370,16 +2066,8 @@
             </w:tcBorders>
           </w:tcPr>
           <w:p>
-            <w:pPr>
-              <w:spacing w:after="0"/>
-            </w:pPr>
             <w:r>
-              <w:rPr>
-                <w:rFonts w:ascii="Arial" w:hAnsi="Arial"/>
-                <w:color w:val="000000"/>
-                <w:sz w:val="18"/>
-              </w:rPr>
-              <w:t>[Completar]</w:t>
+              <w:t>Tiempo de respuesta aceptable al crear y listar pacientes</w:t>
             </w:r>
           </w:p>
         </w:tc>
@@ -2403,16 +2091,8 @@
             </w:tcBorders>
           </w:tcPr>
           <w:p>
-            <w:pPr>
-              <w:spacing w:after="0"/>
-            </w:pPr>
             <w:r>
-              <w:rPr>
-                <w:rFonts w:ascii="Arial" w:hAnsi="Arial"/>
-                <w:color w:val="000000"/>
-                <w:sz w:val="18"/>
-              </w:rPr>
-              <w:t>[Funcional / no funcional]</w:t>
+              <w:t>No funcional / rendimiento</w:t>
             </w:r>
           </w:p>
         </w:tc>
@@ -2436,16 +2116,8 @@
             </w:tcBorders>
           </w:tcPr>
           <w:p>
-            <w:pPr>
-              <w:spacing w:after="0"/>
-            </w:pPr>
             <w:r>
-              <w:rPr>
-                <w:rFonts w:ascii="Arial" w:hAnsi="Arial"/>
-                <w:color w:val="000000"/>
-                <w:sz w:val="18"/>
-              </w:rPr>
-              <w:t>[Completar]</w:t>
+              <w:t>CRUD simple bajo 2 s en local. Ojo: GET /pacientes tiene delay de 5 s a proposito, se registra como observacion. ISO: eficiencia.</w:t>
             </w:r>
           </w:p>
         </w:tc>
@@ -2469,16 +2141,8 @@
             </w:tcBorders>
           </w:tcPr>
           <w:p>
-            <w:pPr>
-              <w:spacing w:after="0"/>
-            </w:pPr>
             <w:r>
-              <w:rPr>
-                <w:rFonts w:ascii="Arial" w:hAnsi="Arial"/>
-                <w:color w:val="000000"/>
-                <w:sz w:val="18"/>
-              </w:rPr>
-              <w:t>[Completar]</w:t>
+              <w:t>ERS NFR-PERF + middleware/delay.js</w:t>
             </w:r>
           </w:p>
         </w:tc>
@@ -2504,16 +2168,8 @@
             </w:tcBorders>
           </w:tcPr>
           <w:p>
-            <w:pPr>
-              <w:spacing w:after="0"/>
-            </w:pPr>
             <w:r>
-              <w:rPr>
-                <w:rFonts w:ascii="Arial" w:hAnsi="Arial"/>
-                <w:color w:val="000000"/>
-                <w:sz w:val="18"/>
-              </w:rPr>
-              <w:t>RQ 05</w:t>
+              <w:t>RQ-05</w:t>
             </w:r>
           </w:p>
         </w:tc>
@@ -2537,16 +2193,8 @@
             </w:tcBorders>
           </w:tcPr>
           <w:p>
-            <w:pPr>
-              <w:spacing w:after="0"/>
-            </w:pPr>
             <w:r>
-              <w:rPr>
-                <w:rFonts w:ascii="Arial" w:hAnsi="Arial"/>
-                <w:color w:val="000000"/>
-                <w:sz w:val="18"/>
-              </w:rPr>
-              <w:t>[Completar]</w:t>
+              <w:t>Formulario Pacientes &gt; Crear claro y con mensajes de error visibles</w:t>
             </w:r>
           </w:p>
         </w:tc>
@@ -2570,16 +2218,8 @@
             </w:tcBorders>
           </w:tcPr>
           <w:p>
-            <w:pPr>
-              <w:spacing w:after="0"/>
-            </w:pPr>
             <w:r>
-              <w:rPr>
-                <w:rFonts w:ascii="Arial" w:hAnsi="Arial"/>
-                <w:color w:val="000000"/>
-                <w:sz w:val="18"/>
-              </w:rPr>
-              <w:t>[Funcional / no funcional]</w:t>
+              <w:t>No funcional / usabilidad</w:t>
             </w:r>
           </w:p>
         </w:tc>
@@ -2603,16 +2243,8 @@
             </w:tcBorders>
           </w:tcPr>
           <w:p>
-            <w:pPr>
-              <w:spacing w:after="0"/>
-            </w:pPr>
             <w:r>
-              <w:rPr>
-                <w:rFonts w:ascii="Arial" w:hAnsi="Arial"/>
-                <w:color w:val="000000"/>
-                <w:sz w:val="18"/>
-              </w:rPr>
-              <w:t>[Completar]</w:t>
+              <w:t>Se entiende que campo fallo y como arreglarlo, en pantalla normal y movil. ISO: usabilidad.</w:t>
             </w:r>
           </w:p>
         </w:tc>
@@ -2636,16 +2268,8 @@
             </w:tcBorders>
           </w:tcPr>
           <w:p>
-            <w:pPr>
-              <w:spacing w:after="0"/>
-            </w:pPr>
             <w:r>
-              <w:rPr>
-                <w:rFonts w:ascii="Arial" w:hAnsi="Arial"/>
-                <w:color w:val="000000"/>
-                <w:sz w:val="18"/>
-              </w:rPr>
-              <w:t>[Completar]</w:t>
+              <w:t>ERS NFR-USAB + FRONTEND PacientesTabCreate</w:t>
             </w:r>
           </w:p>
         </w:tc>
@@ -2885,16 +2509,8 @@
             </w:tcBorders>
           </w:tcPr>
           <w:p>
-            <w:pPr>
-              <w:spacing w:after="0"/>
-            </w:pPr>
             <w:r>
-              <w:rPr>
-                <w:rFonts w:ascii="Arial" w:hAnsi="Arial"/>
-                <w:color w:val="000000"/>
-                <w:sz w:val="18"/>
-              </w:rPr>
-              <w:t>[Flujos críticos y reglas de negocio]</w:t>
+              <w:t>Crear y listar pacientes, con datos buenos y malos</w:t>
             </w:r>
           </w:p>
         </w:tc>
@@ -2918,16 +2534,8 @@
             </w:tcBorders>
           </w:tcPr>
           <w:p>
-            <w:pPr>
-              <w:spacing w:after="0"/>
-            </w:pPr>
             <w:r>
-              <w:rPr>
-                <w:rFonts w:ascii="Arial" w:hAnsi="Arial"/>
-                <w:color w:val="000000"/>
-                <w:sz w:val="18"/>
-              </w:rPr>
-              <w:t>[Completar]</w:t>
+              <w:t>Es el flujo mas importante y donde estan las reglas del negocio.</w:t>
             </w:r>
           </w:p>
         </w:tc>
@@ -2951,16 +2559,8 @@
             </w:tcBorders>
           </w:tcPr>
           <w:p>
-            <w:pPr>
-              <w:spacing w:after="0"/>
-            </w:pPr>
             <w:r>
-              <w:rPr>
-                <w:rFonts w:ascii="Arial" w:hAnsi="Arial"/>
-                <w:color w:val="000000"/>
-                <w:sz w:val="18"/>
-              </w:rPr>
-              <w:t>[Manual, API, automatizada]</w:t>
+              <w:t>Manual + Postman/Swagger</w:t>
             </w:r>
           </w:p>
         </w:tc>
@@ -3019,16 +2619,8 @@
             </w:tcBorders>
           </w:tcPr>
           <w:p>
-            <w:pPr>
-              <w:spacing w:after="0"/>
-            </w:pPr>
             <w:r>
-              <w:rPr>
-                <w:rFonts w:ascii="Arial" w:hAnsi="Arial"/>
-                <w:color w:val="000000"/>
-                <w:sz w:val="18"/>
-              </w:rPr>
-              <w:t>[Concurrencia, tiempos de respuesta, estabilidad]</w:t>
+              <w:t>Medir cuanto demora crear y listar con pocos datos</w:t>
             </w:r>
           </w:p>
         </w:tc>
@@ -3052,16 +2644,8 @@
             </w:tcBorders>
           </w:tcPr>
           <w:p>
-            <w:pPr>
-              <w:spacing w:after="0"/>
-            </w:pPr>
             <w:r>
-              <w:rPr>
-                <w:rFonts w:ascii="Arial" w:hAnsi="Arial"/>
-                <w:color w:val="000000"/>
-                <w:sz w:val="18"/>
-              </w:rPr>
-              <w:t>[Completar]</w:t>
+              <w:t>Hay un delay de 5 s en la lista y contraseñas en texto plano; hay que dejar constancia.</w:t>
             </w:r>
           </w:p>
         </w:tc>
@@ -3085,16 +2669,8 @@
             </w:tcBorders>
           </w:tcPr>
           <w:p>
-            <w:pPr>
-              <w:spacing w:after="0"/>
-            </w:pPr>
             <w:r>
-              <w:rPr>
-                <w:rFonts w:ascii="Arial" w:hAnsi="Arial"/>
-                <w:color w:val="000000"/>
-                <w:sz w:val="18"/>
-              </w:rPr>
-              <w:t>[Ejemplo: JMeter]</w:t>
+              <w:t>Cronometro + DevTools red</w:t>
             </w:r>
           </w:p>
         </w:tc>
@@ -3153,16 +2729,8 @@
             </w:tcBorders>
           </w:tcPr>
           <w:p>
-            <w:pPr>
-              <w:spacing w:after="0"/>
-            </w:pPr>
             <w:r>
-              <w:rPr>
-                <w:rFonts w:ascii="Arial" w:hAnsi="Arial"/>
-                <w:color w:val="000000"/>
-                <w:sz w:val="18"/>
-              </w:rPr>
-              <w:t>[Autenticación, autorización, validación, OWASP]</w:t>
+              <w:t>Login, roles (401/403), validacion de entradas y pruebas simples XSS/SQLi sin dañar nada</w:t>
             </w:r>
           </w:p>
         </w:tc>
@@ -3186,16 +2754,8 @@
             </w:tcBorders>
           </w:tcPr>
           <w:p>
-            <w:pPr>
-              <w:spacing w:after="0"/>
-            </w:pPr>
             <w:r>
-              <w:rPr>
-                <w:rFonts w:ascii="Arial" w:hAnsi="Arial"/>
-                <w:color w:val="000000"/>
-                <w:sz w:val="18"/>
-              </w:rPr>
-              <w:t>[Completar]</w:t>
+              <w:t>Hay datos de salud y el codigo es vulnerable a proposito.</w:t>
             </w:r>
           </w:p>
         </w:tc>
@@ -3219,16 +2779,8 @@
             </w:tcBorders>
           </w:tcPr>
           <w:p>
-            <w:pPr>
-              <w:spacing w:after="0"/>
-            </w:pPr>
             <w:r>
-              <w:rPr>
-                <w:rFonts w:ascii="Arial" w:hAnsi="Arial"/>
-                <w:color w:val="000000"/>
-                <w:sz w:val="18"/>
-              </w:rPr>
-              <w:t>[SAST, DAST, revisión manual]</w:t>
+              <w:t>Revision manual + Swagger (SAST/DAST queda fuera por ahora)</w:t>
             </w:r>
           </w:p>
         </w:tc>
@@ -3287,16 +2839,8 @@
             </w:tcBorders>
           </w:tcPr>
           <w:p>
-            <w:pPr>
-              <w:spacing w:after="0"/>
-            </w:pPr>
             <w:r>
-              <w:rPr>
-                <w:rFonts w:ascii="Arial" w:hAnsi="Arial"/>
-                <w:color w:val="000000"/>
-                <w:sz w:val="18"/>
-              </w:rPr>
-              <w:t>[Claridad, navegación, accesibilidad]</w:t>
+              <w:t>Revisar que el formulario se entienda y los errores ayuden</w:t>
             </w:r>
           </w:p>
         </w:tc>
@@ -3320,16 +2864,8 @@
             </w:tcBorders>
           </w:tcPr>
           <w:p>
-            <w:pPr>
-              <w:spacing w:after="0"/>
-            </w:pPr>
             <w:r>
-              <w:rPr>
-                <w:rFonts w:ascii="Arial" w:hAnsi="Arial"/>
-                <w:color w:val="000000"/>
-                <w:sz w:val="18"/>
-              </w:rPr>
-              <w:t>[Completar]</w:t>
+              <w:t>Lo usan adultos mayores y personal de salud con poco tiempo.</w:t>
             </w:r>
           </w:p>
         </w:tc>
@@ -3353,16 +2889,8 @@
             </w:tcBorders>
           </w:tcPr>
           <w:p>
-            <w:pPr>
-              <w:spacing w:after="0"/>
-            </w:pPr>
             <w:r>
-              <w:rPr>
-                <w:rFonts w:ascii="Arial" w:hAnsi="Arial"/>
-                <w:color w:val="000000"/>
-                <w:sz w:val="18"/>
-              </w:rPr>
-              <w:t>[Lista de verificación]</w:t>
+              <w:t>Lista de chequeo simple</w:t>
             </w:r>
           </w:p>
         </w:tc>
@@ -3421,16 +2949,8 @@
             </w:tcBorders>
           </w:tcPr>
           <w:p>
-            <w:pPr>
-              <w:spacing w:after="0"/>
-            </w:pPr>
             <w:r>
-              <w:rPr>
-                <w:rFonts w:ascii="Arial" w:hAnsi="Arial"/>
-                <w:color w:val="000000"/>
-                <w:sz w:val="18"/>
-              </w:rPr>
-              <w:t>[Comunicación entre componentes]</w:t>
+              <w:t>Que el frontend hable bien con el backend y la base de datos</w:t>
             </w:r>
           </w:p>
         </w:tc>
@@ -3454,16 +2974,8 @@
             </w:tcBorders>
           </w:tcPr>
           <w:p>
-            <w:pPr>
-              <w:spacing w:after="0"/>
-            </w:pPr>
             <w:r>
-              <w:rPr>
-                <w:rFonts w:ascii="Arial" w:hAnsi="Arial"/>
-                <w:color w:val="000000"/>
-                <w:sz w:val="18"/>
-              </w:rPr>
-              <w:t>[Completar]</w:t>
+              <w:t>Si se cae un contenedor nada funciona.</w:t>
             </w:r>
           </w:p>
         </w:tc>
@@ -3487,16 +2999,8 @@
             </w:tcBorders>
           </w:tcPr>
           <w:p>
-            <w:pPr>
-              <w:spacing w:after="0"/>
-            </w:pPr>
             <w:r>
-              <w:rPr>
-                <w:rFonts w:ascii="Arial" w:hAnsi="Arial"/>
-                <w:color w:val="000000"/>
-                <w:sz w:val="18"/>
-              </w:rPr>
-              <w:t>[Postman, Swagger u otra]</w:t>
+              <w:t>Swagger + docker ps</w:t>
             </w:r>
           </w:p>
         </w:tc>
@@ -3736,16 +3240,8 @@
             </w:tcBorders>
           </w:tcPr>
           <w:p>
-            <w:pPr>
-              <w:spacing w:after="0"/>
-            </w:pPr>
             <w:r>
-              <w:rPr>
-                <w:rFonts w:ascii="Arial" w:hAnsi="Arial"/>
-                <w:color w:val="000000"/>
-                <w:sz w:val="18"/>
-              </w:rPr>
-              <w:t>[Completar]</w:t>
+              <w:t>Datos personales y de salud (Ley 19.628 Chile)</w:t>
             </w:r>
           </w:p>
         </w:tc>
@@ -3769,16 +3265,8 @@
             </w:tcBorders>
           </w:tcPr>
           <w:p>
-            <w:pPr>
-              <w:spacing w:after="0"/>
-            </w:pPr>
             <w:r>
-              <w:rPr>
-                <w:rFonts w:ascii="Arial" w:hAnsi="Arial"/>
-                <w:color w:val="000000"/>
-                <w:sz w:val="18"/>
-              </w:rPr>
-              <w:t>[Completar]</w:t>
+              <w:t>Verificar que no se muestren datos de otros y que los errores no filtren info.</w:t>
             </w:r>
           </w:p>
         </w:tc>
@@ -3802,16 +3290,8 @@
             </w:tcBorders>
           </w:tcPr>
           <w:p>
-            <w:pPr>
-              <w:spacing w:after="0"/>
-            </w:pPr>
             <w:r>
-              <w:rPr>
-                <w:rFonts w:ascii="Arial" w:hAnsi="Arial"/>
-                <w:color w:val="000000"/>
-                <w:sz w:val="18"/>
-              </w:rPr>
-              <w:t>[Captura, resultado, log o reporte]</w:t>
+              <w:t>Captura de lista por rol + mensaje 400</w:t>
             </w:r>
           </w:p>
         </w:tc>
@@ -3870,16 +3350,8 @@
             </w:tcBorders>
           </w:tcPr>
           <w:p>
-            <w:pPr>
-              <w:spacing w:after="0"/>
-            </w:pPr>
             <w:r>
-              <w:rPr>
-                <w:rFonts w:ascii="Arial" w:hAnsi="Arial"/>
-                <w:color w:val="000000"/>
-                <w:sz w:val="18"/>
-              </w:rPr>
-              <w:t>[Completar]</w:t>
+              <w:t>Solo medico/admin crean (RB-1/RB-2/RB-3)</w:t>
             </w:r>
           </w:p>
         </w:tc>
@@ -3903,16 +3375,8 @@
             </w:tcBorders>
           </w:tcPr>
           <w:p>
-            <w:pPr>
-              <w:spacing w:after="0"/>
-            </w:pPr>
             <w:r>
-              <w:rPr>
-                <w:rFonts w:ascii="Arial" w:hAnsi="Arial"/>
-                <w:color w:val="000000"/>
-                <w:sz w:val="18"/>
-              </w:rPr>
-              <w:t>[Completar]</w:t>
+              <w:t>Probar POST como paciente (403) y sin token (401).</w:t>
             </w:r>
           </w:p>
         </w:tc>
@@ -3936,16 +3400,8 @@
             </w:tcBorders>
           </w:tcPr>
           <w:p>
-            <w:pPr>
-              <w:spacing w:after="0"/>
-            </w:pPr>
             <w:r>
-              <w:rPr>
-                <w:rFonts w:ascii="Arial" w:hAnsi="Arial"/>
-                <w:color w:val="000000"/>
-                <w:sz w:val="18"/>
-              </w:rPr>
-              <w:t>[Completar]</w:t>
+              <w:t>Respuesta 401/403 guardada</w:t>
             </w:r>
           </w:p>
         </w:tc>
@@ -4004,16 +3460,8 @@
             </w:tcBorders>
           </w:tcPr>
           <w:p>
-            <w:pPr>
-              <w:spacing w:after="0"/>
-            </w:pPr>
             <w:r>
-              <w:rPr>
-                <w:rFonts w:ascii="Arial" w:hAnsi="Arial"/>
-                <w:color w:val="000000"/>
-                <w:sz w:val="18"/>
-              </w:rPr>
-              <w:t>[Completar]</w:t>
+              <w:t>Todo cambio debe quedar en auditoria (RF-5)</w:t>
             </w:r>
           </w:p>
         </w:tc>
@@ -4037,16 +3485,8 @@
             </w:tcBorders>
           </w:tcPr>
           <w:p>
-            <w:pPr>
-              <w:spacing w:after="0"/>
-            </w:pPr>
             <w:r>
-              <w:rPr>
-                <w:rFonts w:ascii="Arial" w:hAnsi="Arial"/>
-                <w:color w:val="000000"/>
-                <w:sz w:val="18"/>
-              </w:rPr>
-              <w:t>[Completar]</w:t>
+              <w:t>Crear paciente y revisar GET /auditoria con PACIENTES_CREAR.</w:t>
             </w:r>
           </w:p>
         </w:tc>
@@ -4070,16 +3510,8 @@
             </w:tcBorders>
           </w:tcPr>
           <w:p>
-            <w:pPr>
-              <w:spacing w:after="0"/>
-            </w:pPr>
             <w:r>
-              <w:rPr>
-                <w:rFonts w:ascii="Arial" w:hAnsi="Arial"/>
-                <w:color w:val="000000"/>
-                <w:sz w:val="18"/>
-              </w:rPr>
-              <w:t>[Completar]</w:t>
+              <w:t>Fila de auditoria</w:t>
             </w:r>
           </w:p>
         </w:tc>
@@ -4138,16 +3570,8 @@
             </w:tcBorders>
           </w:tcPr>
           <w:p>
-            <w:pPr>
-              <w:spacing w:after="0"/>
-            </w:pPr>
             <w:r>
-              <w:rPr>
-                <w:rFonts w:ascii="Arial" w:hAnsi="Arial"/>
-                <w:color w:val="000000"/>
-                <w:sz w:val="18"/>
-              </w:rPr>
-              <w:t>[Completar al menos dos]</w:t>
+              <w:t>XSS en nombre y SQLi simple en login/busqueda</w:t>
             </w:r>
           </w:p>
         </w:tc>
@@ -4171,16 +3595,8 @@
             </w:tcBorders>
           </w:tcPr>
           <w:p>
-            <w:pPr>
-              <w:spacing w:after="0"/>
-            </w:pPr>
             <w:r>
-              <w:rPr>
-                <w:rFonts w:ascii="Arial" w:hAnsi="Arial"/>
-                <w:color w:val="000000"/>
-                <w:sz w:val="18"/>
-              </w:rPr>
-              <w:t>[Completar]</w:t>
+              <w:t>Probar &lt;script&gt;alert(1)&lt;/script&gt; y comilla simple; se espera rechazo 400 sin ejecutar nada.</w:t>
             </w:r>
           </w:p>
         </w:tc>
@@ -4204,16 +3620,8 @@
             </w:tcBorders>
           </w:tcPr>
           <w:p>
-            <w:pPr>
-              <w:spacing w:after="0"/>
-            </w:pPr>
             <w:r>
-              <w:rPr>
-                <w:rFonts w:ascii="Arial" w:hAnsi="Arial"/>
-                <w:color w:val="000000"/>
-                <w:sz w:val="18"/>
-              </w:rPr>
-              <w:t>[Completar]</w:t>
+              <w:t>Respuesta del API</w:t>
             </w:r>
           </w:p>
         </w:tc>
@@ -4272,16 +3680,8 @@
             </w:tcBorders>
           </w:tcPr>
           <w:p>
-            <w:pPr>
-              <w:spacing w:after="0"/>
-            </w:pPr>
             <w:r>
-              <w:rPr>
-                <w:rFonts w:ascii="Arial" w:hAnsi="Arial"/>
-                <w:color w:val="000000"/>
-                <w:sz w:val="18"/>
-              </w:rPr>
-              <w:t>[Ley, estándar o requisito del caso]</w:t>
+              <w:t>Ley 19.628 + ERS NFR-SEG (TLS, bcrypt, JWT)</w:t>
             </w:r>
           </w:p>
         </w:tc>
@@ -4305,16 +3705,8 @@
             </w:tcBorders>
           </w:tcPr>
           <w:p>
-            <w:pPr>
-              <w:spacing w:after="0"/>
-            </w:pPr>
             <w:r>
-              <w:rPr>
-                <w:rFonts w:ascii="Arial" w:hAnsi="Arial"/>
-                <w:color w:val="000000"/>
-                <w:sz w:val="18"/>
-              </w:rPr>
-              <w:t>[Cómo se validará]</w:t>
+              <w:t>Se revisa que pida login JWT por rol. Hallazgo: el codigo guarda clave en texto plano, se informa y no se corrige en esta etapa.</w:t>
             </w:r>
           </w:p>
         </w:tc>
@@ -4338,16 +3730,8 @@
             </w:tcBorders>
           </w:tcPr>
           <w:p>
-            <w:pPr>
-              <w:spacing w:after="0"/>
-            </w:pPr>
             <w:r>
-              <w:rPr>
-                <w:rFonts w:ascii="Arial" w:hAnsi="Arial"/>
-                <w:color w:val="000000"/>
-                <w:sz w:val="18"/>
-              </w:rPr>
-              <w:t>[Completar]</w:t>
+              <w:t>Token + hallazgo anotado</w:t>
             </w:r>
           </w:p>
         </w:tc>
@@ -4618,16 +4002,8 @@
             </w:tcBorders>
           </w:tcPr>
           <w:p>
-            <w:pPr>
-              <w:spacing w:after="0"/>
-            </w:pPr>
             <w:r>
-              <w:rPr>
-                <w:rFonts w:ascii="Arial" w:hAnsi="Arial"/>
-                <w:color w:val="000000"/>
-                <w:sz w:val="18"/>
-              </w:rPr>
-              <w:t>RS 01</w:t>
+              <w:t>RS-01</w:t>
             </w:r>
           </w:p>
         </w:tc>
@@ -4651,16 +4027,8 @@
             </w:tcBorders>
           </w:tcPr>
           <w:p>
-            <w:pPr>
-              <w:spacing w:after="0"/>
-            </w:pPr>
             <w:r>
-              <w:rPr>
-                <w:rFonts w:ascii="Arial" w:hAnsi="Arial"/>
-                <w:color w:val="000000"/>
-                <w:sz w:val="18"/>
-              </w:rPr>
-              <w:t>[Completar]</w:t>
+              <w:t>Se guarda un paciente con RUT o email malo</w:t>
             </w:r>
           </w:p>
         </w:tc>
@@ -4684,16 +4052,8 @@
             </w:tcBorders>
           </w:tcPr>
           <w:p>
-            <w:pPr>
-              <w:spacing w:after="0"/>
-            </w:pPr>
             <w:r>
-              <w:rPr>
-                <w:rFonts w:ascii="Arial" w:hAnsi="Arial"/>
-                <w:color w:val="000000"/>
-                <w:sz w:val="18"/>
-              </w:rPr>
-              <w:t>[Alto / medio / bajo]</w:t>
+              <w:t>Alto</w:t>
             </w:r>
           </w:p>
         </w:tc>
@@ -4717,16 +4077,8 @@
             </w:tcBorders>
           </w:tcPr>
           <w:p>
-            <w:pPr>
-              <w:spacing w:after="0"/>
-            </w:pPr>
             <w:r>
-              <w:rPr>
-                <w:rFonts w:ascii="Arial" w:hAnsi="Arial"/>
-                <w:color w:val="000000"/>
-                <w:sz w:val="18"/>
-              </w:rPr>
-              <w:t>[Alto / medio / bajo]</w:t>
+              <w:t>Media</w:t>
             </w:r>
           </w:p>
         </w:tc>
@@ -4750,16 +4102,8 @@
             </w:tcBorders>
           </w:tcPr>
           <w:p>
-            <w:pPr>
-              <w:spacing w:after="0"/>
-            </w:pPr>
             <w:r>
-              <w:rPr>
-                <w:rFonts w:ascii="Arial" w:hAnsi="Arial"/>
-                <w:color w:val="000000"/>
-                <w:sz w:val="18"/>
-              </w:rPr>
-              <w:t>[Alta / media / baja]</w:t>
+              <w:t>Alta</w:t>
             </w:r>
           </w:p>
         </w:tc>
@@ -4783,16 +4127,8 @@
             </w:tcBorders>
           </w:tcPr>
           <w:p>
-            <w:pPr>
-              <w:spacing w:after="0"/>
-            </w:pPr>
             <w:r>
-              <w:rPr>
-                <w:rFonts w:ascii="Arial" w:hAnsi="Arial"/>
-                <w:color w:val="000000"/>
-                <w:sz w:val="18"/>
-              </w:rPr>
-              <w:t>[Completar]</w:t>
+              <w:t>CP02, CP03 y CP04</w:t>
             </w:r>
           </w:p>
         </w:tc>
@@ -4818,16 +4154,8 @@
             </w:tcBorders>
           </w:tcPr>
           <w:p>
-            <w:pPr>
-              <w:spacing w:after="0"/>
-            </w:pPr>
             <w:r>
-              <w:rPr>
-                <w:rFonts w:ascii="Arial" w:hAnsi="Arial"/>
-                <w:color w:val="000000"/>
-                <w:sz w:val="18"/>
-              </w:rPr>
-              <w:t>RS 02</w:t>
+              <w:t>RS-02</w:t>
             </w:r>
           </w:p>
         </w:tc>
@@ -4851,16 +4179,8 @@
             </w:tcBorders>
           </w:tcPr>
           <w:p>
-            <w:pPr>
-              <w:spacing w:after="0"/>
-            </w:pPr>
             <w:r>
-              <w:rPr>
-                <w:rFonts w:ascii="Arial" w:hAnsi="Arial"/>
-                <w:color w:val="000000"/>
-                <w:sz w:val="18"/>
-              </w:rPr>
-              <w:t>[Completar]</w:t>
+              <w:t>Un paciente entra a datos de otros o crea pacientes</w:t>
             </w:r>
           </w:p>
         </w:tc>
@@ -4884,16 +4204,8 @@
             </w:tcBorders>
           </w:tcPr>
           <w:p>
-            <w:pPr>
-              <w:spacing w:after="0"/>
-            </w:pPr>
             <w:r>
-              <w:rPr>
-                <w:rFonts w:ascii="Arial" w:hAnsi="Arial"/>
-                <w:color w:val="000000"/>
-                <w:sz w:val="18"/>
-              </w:rPr>
-              <w:t>[Alto / medio / bajo]</w:t>
+              <w:t>Alto</w:t>
             </w:r>
           </w:p>
         </w:tc>
@@ -4917,16 +4229,8 @@
             </w:tcBorders>
           </w:tcPr>
           <w:p>
-            <w:pPr>
-              <w:spacing w:after="0"/>
-            </w:pPr>
             <w:r>
-              <w:rPr>
-                <w:rFonts w:ascii="Arial" w:hAnsi="Arial"/>
-                <w:color w:val="000000"/>
-                <w:sz w:val="18"/>
-              </w:rPr>
-              <w:t>[Alto / medio / bajo]</w:t>
+              <w:t>Media</w:t>
             </w:r>
           </w:p>
         </w:tc>
@@ -4950,16 +4254,8 @@
             </w:tcBorders>
           </w:tcPr>
           <w:p>
-            <w:pPr>
-              <w:spacing w:after="0"/>
-            </w:pPr>
             <w:r>
-              <w:rPr>
-                <w:rFonts w:ascii="Arial" w:hAnsi="Arial"/>
-                <w:color w:val="000000"/>
-                <w:sz w:val="18"/>
-              </w:rPr>
-              <w:t>[Alta / media / baja]</w:t>
+              <w:t>Alta</w:t>
             </w:r>
           </w:p>
         </w:tc>
@@ -4983,16 +4279,8 @@
             </w:tcBorders>
           </w:tcPr>
           <w:p>
-            <w:pPr>
-              <w:spacing w:after="0"/>
-            </w:pPr>
             <w:r>
-              <w:rPr>
-                <w:rFonts w:ascii="Arial" w:hAnsi="Arial"/>
-                <w:color w:val="000000"/>
-                <w:sz w:val="18"/>
-              </w:rPr>
-              <w:t>[Completar]</w:t>
+              <w:t>CP05 (403/401)</w:t>
             </w:r>
           </w:p>
         </w:tc>
@@ -5018,16 +4306,8 @@
             </w:tcBorders>
           </w:tcPr>
           <w:p>
-            <w:pPr>
-              <w:spacing w:after="0"/>
-            </w:pPr>
             <w:r>
-              <w:rPr>
-                <w:rFonts w:ascii="Arial" w:hAnsi="Arial"/>
-                <w:color w:val="000000"/>
-                <w:sz w:val="18"/>
-              </w:rPr>
-              <w:t>RS 03</w:t>
+              <w:t>RS-03</w:t>
             </w:r>
           </w:p>
         </w:tc>
@@ -5051,16 +4331,8 @@
             </w:tcBorders>
           </w:tcPr>
           <w:p>
-            <w:pPr>
-              <w:spacing w:after="0"/>
-            </w:pPr>
             <w:r>
-              <w:rPr>
-                <w:rFonts w:ascii="Arial" w:hAnsi="Arial"/>
-                <w:color w:val="000000"/>
-                <w:sz w:val="18"/>
-              </w:rPr>
-              <w:t>[Completar]</w:t>
+              <w:t>No queda registro en auditoria de quien creo que</w:t>
             </w:r>
           </w:p>
         </w:tc>
@@ -5084,16 +4356,8 @@
             </w:tcBorders>
           </w:tcPr>
           <w:p>
-            <w:pPr>
-              <w:spacing w:after="0"/>
-            </w:pPr>
             <w:r>
-              <w:rPr>
-                <w:rFonts w:ascii="Arial" w:hAnsi="Arial"/>
-                <w:color w:val="000000"/>
-                <w:sz w:val="18"/>
-              </w:rPr>
-              <w:t>[Alto / medio / bajo]</w:t>
+              <w:t>Media</w:t>
             </w:r>
           </w:p>
         </w:tc>
@@ -5117,16 +4381,8 @@
             </w:tcBorders>
           </w:tcPr>
           <w:p>
-            <w:pPr>
-              <w:spacing w:after="0"/>
-            </w:pPr>
             <w:r>
-              <w:rPr>
-                <w:rFonts w:ascii="Arial" w:hAnsi="Arial"/>
-                <w:color w:val="000000"/>
-                <w:sz w:val="18"/>
-              </w:rPr>
-              <w:t>[Alto / medio / bajo]</w:t>
+              <w:t>Media</w:t>
             </w:r>
           </w:p>
         </w:tc>
@@ -5150,16 +4406,8 @@
             </w:tcBorders>
           </w:tcPr>
           <w:p>
-            <w:pPr>
-              <w:spacing w:after="0"/>
-            </w:pPr>
             <w:r>
-              <w:rPr>
-                <w:rFonts w:ascii="Arial" w:hAnsi="Arial"/>
-                <w:color w:val="000000"/>
-                <w:sz w:val="18"/>
-              </w:rPr>
-              <w:t>[Alta / media / baja]</w:t>
+              <w:t>Media</w:t>
             </w:r>
           </w:p>
         </w:tc>
@@ -5183,16 +4431,8 @@
             </w:tcBorders>
           </w:tcPr>
           <w:p>
-            <w:pPr>
-              <w:spacing w:after="0"/>
-            </w:pPr>
             <w:r>
-              <w:rPr>
-                <w:rFonts w:ascii="Arial" w:hAnsi="Arial"/>
-                <w:color w:val="000000"/>
-                <w:sz w:val="18"/>
-              </w:rPr>
-              <w:t>[Completar]</w:t>
+              <w:t>Revisar /auditoria tras CP01</w:t>
             </w:r>
           </w:p>
         </w:tc>
@@ -5218,16 +4458,8 @@
             </w:tcBorders>
           </w:tcPr>
           <w:p>
-            <w:pPr>
-              <w:spacing w:after="0"/>
-            </w:pPr>
             <w:r>
-              <w:rPr>
-                <w:rFonts w:ascii="Arial" w:hAnsi="Arial"/>
-                <w:color w:val="000000"/>
-                <w:sz w:val="18"/>
-              </w:rPr>
-              <w:t>RS 04</w:t>
+              <w:t>RS-04</w:t>
             </w:r>
           </w:p>
         </w:tc>
@@ -5251,16 +4483,8 @@
             </w:tcBorders>
           </w:tcPr>
           <w:p>
-            <w:pPr>
-              <w:spacing w:after="0"/>
-            </w:pPr>
             <w:r>
-              <w:rPr>
-                <w:rFonts w:ascii="Arial" w:hAnsi="Arial"/>
-                <w:color w:val="000000"/>
-                <w:sz w:val="18"/>
-              </w:rPr>
-              <w:t>[Completar]</w:t>
+              <w:t>La lista de pacientes se vuelve lenta (delay 5 s)</w:t>
             </w:r>
           </w:p>
         </w:tc>
@@ -5284,16 +4508,8 @@
             </w:tcBorders>
           </w:tcPr>
           <w:p>
-            <w:pPr>
-              <w:spacing w:after="0"/>
-            </w:pPr>
             <w:r>
-              <w:rPr>
-                <w:rFonts w:ascii="Arial" w:hAnsi="Arial"/>
-                <w:color w:val="000000"/>
-                <w:sz w:val="18"/>
-              </w:rPr>
-              <w:t>[Alto / medio / bajo]</w:t>
+              <w:t>Media</w:t>
             </w:r>
           </w:p>
         </w:tc>
@@ -5317,16 +4533,8 @@
             </w:tcBorders>
           </w:tcPr>
           <w:p>
-            <w:pPr>
-              <w:spacing w:after="0"/>
-            </w:pPr>
             <w:r>
-              <w:rPr>
-                <w:rFonts w:ascii="Arial" w:hAnsi="Arial"/>
-                <w:color w:val="000000"/>
-                <w:sz w:val="18"/>
-              </w:rPr>
-              <w:t>[Alto / medio / bajo]</w:t>
+              <w:t>Alta</w:t>
             </w:r>
           </w:p>
         </w:tc>
@@ -5350,16 +4558,8 @@
             </w:tcBorders>
           </w:tcPr>
           <w:p>
-            <w:pPr>
-              <w:spacing w:after="0"/>
-            </w:pPr>
             <w:r>
-              <w:rPr>
-                <w:rFonts w:ascii="Arial" w:hAnsi="Arial"/>
-                <w:color w:val="000000"/>
-                <w:sz w:val="18"/>
-              </w:rPr>
-              <w:t>[Alta / media / baja]</w:t>
+              <w:t>Media</w:t>
             </w:r>
           </w:p>
         </w:tc>
@@ -5383,16 +4583,8 @@
             </w:tcBorders>
           </w:tcPr>
           <w:p>
-            <w:pPr>
-              <w:spacing w:after="0"/>
-            </w:pPr>
             <w:r>
-              <w:rPr>
-                <w:rFonts w:ascii="Arial" w:hAnsi="Arial"/>
-                <w:color w:val="000000"/>
-                <w:sz w:val="18"/>
-              </w:rPr>
-              <w:t>[Completar]</w:t>
+              <w:t>Medir tiempo en RQ-04</w:t>
             </w:r>
           </w:p>
         </w:tc>
@@ -6604,15 +5796,7 @@
             </w:tcBorders>
           </w:tcPr>
           <w:p>
-            <w:pPr>
-              <w:spacing w:after="0"/>
-            </w:pPr>
             <w:r>
-              <w:rPr>
-                <w:rFonts w:ascii="Arial" w:hAnsi="Arial"/>
-                <w:color w:val="000000"/>
-                <w:sz w:val="18"/>
-              </w:rPr>
               <w:t>Levantar y reconocer el sistema</w:t>
             </w:r>
           </w:p>
@@ -6637,16 +5821,8 @@
             </w:tcBorders>
           </w:tcPr>
           <w:p>
-            <w:pPr>
-              <w:spacing w:after="0"/>
-            </w:pPr>
             <w:r>
-              <w:rPr>
-                <w:rFonts w:ascii="Arial" w:hAnsi="Arial"/>
-                <w:color w:val="000000"/>
-                <w:sz w:val="18"/>
-              </w:rPr>
-              <w:t>[Completar]</w:t>
+              <w:t>Benjamin</w:t>
             </w:r>
           </w:p>
         </w:tc>
@@ -6670,16 +5846,8 @@
             </w:tcBorders>
           </w:tcPr>
           <w:p>
-            <w:pPr>
-              <w:spacing w:after="0"/>
-            </w:pPr>
             <w:r>
-              <w:rPr>
-                <w:rFonts w:ascii="Arial" w:hAnsi="Arial"/>
-                <w:color w:val="000000"/>
-                <w:sz w:val="18"/>
-              </w:rPr>
-              <w:t>[Completar]</w:t>
+              <w:t>29-09-2026</w:t>
             </w:r>
           </w:p>
         </w:tc>
@@ -6703,16 +5871,8 @@
             </w:tcBorders>
           </w:tcPr>
           <w:p>
-            <w:pPr>
-              <w:spacing w:after="0"/>
-            </w:pPr>
             <w:r>
-              <w:rPr>
-                <w:rFonts w:ascii="Arial" w:hAnsi="Arial"/>
-                <w:color w:val="000000"/>
-                <w:sz w:val="18"/>
-              </w:rPr>
-              <w:t>[Capturas, registro o bitácora]</w:t>
+              <w:t>Docker ok + Swagger /docs</w:t>
             </w:r>
           </w:p>
         </w:tc>
@@ -6738,15 +5898,7 @@
             </w:tcBorders>
           </w:tcPr>
           <w:p>
-            <w:pPr>
-              <w:spacing w:after="0"/>
-            </w:pPr>
             <w:r>
-              <w:rPr>
-                <w:rFonts w:ascii="Arial" w:hAnsi="Arial"/>
-                <w:color w:val="000000"/>
-                <w:sz w:val="18"/>
-              </w:rPr>
               <w:t>Definir alcance y requisitos</w:t>
             </w:r>
           </w:p>
@@ -6771,16 +5923,8 @@
             </w:tcBorders>
           </w:tcPr>
           <w:p>
-            <w:pPr>
-              <w:spacing w:after="0"/>
-            </w:pPr>
             <w:r>
-              <w:rPr>
-                <w:rFonts w:ascii="Arial" w:hAnsi="Arial"/>
-                <w:color w:val="000000"/>
-                <w:sz w:val="18"/>
-              </w:rPr>
-              <w:t>[Completar]</w:t>
+              <w:t>Ambos</w:t>
             </w:r>
           </w:p>
         </w:tc>
@@ -6804,16 +5948,8 @@
             </w:tcBorders>
           </w:tcPr>
           <w:p>
-            <w:pPr>
-              <w:spacing w:after="0"/>
-            </w:pPr>
             <w:r>
-              <w:rPr>
-                <w:rFonts w:ascii="Arial" w:hAnsi="Arial"/>
-                <w:color w:val="000000"/>
-                <w:sz w:val="18"/>
-              </w:rPr>
-              <w:t>[Completar]</w:t>
+              <w:t>30-09-2026</w:t>
             </w:r>
           </w:p>
         </w:tc>
@@ -6837,16 +5973,8 @@
             </w:tcBorders>
           </w:tcPr>
           <w:p>
-            <w:pPr>
-              <w:spacing w:after="0"/>
-            </w:pPr>
             <w:r>
-              <w:rPr>
-                <w:rFonts w:ascii="Arial" w:hAnsi="Arial"/>
-                <w:color w:val="000000"/>
-                <w:sz w:val="18"/>
-              </w:rPr>
-              <w:t>[Secciones 2 y 3]</w:t>
+              <w:t>Secciones 2 y 3</w:t>
             </w:r>
           </w:p>
         </w:tc>
@@ -6872,16 +6000,8 @@
             </w:tcBorders>
           </w:tcPr>
           <w:p>
-            <w:pPr>
-              <w:spacing w:after="0"/>
-            </w:pPr>
             <w:r>
-              <w:rPr>
-                <w:rFonts w:ascii="Arial" w:hAnsi="Arial"/>
-                <w:color w:val="000000"/>
-                <w:sz w:val="18"/>
-              </w:rPr>
-              <w:t>Diseñar estrategia y riesgos</w:t>
+              <w:t>Estrategia y riesgos</w:t>
             </w:r>
           </w:p>
         </w:tc>
@@ -6905,16 +6025,8 @@
             </w:tcBorders>
           </w:tcPr>
           <w:p>
-            <w:pPr>
-              <w:spacing w:after="0"/>
-            </w:pPr>
             <w:r>
-              <w:rPr>
-                <w:rFonts w:ascii="Arial" w:hAnsi="Arial"/>
-                <w:color w:val="000000"/>
-                <w:sz w:val="18"/>
-              </w:rPr>
-              <w:t>[Completar]</w:t>
+              <w:t>Gerardo</w:t>
             </w:r>
           </w:p>
         </w:tc>
@@ -6938,16 +6050,8 @@
             </w:tcBorders>
           </w:tcPr>
           <w:p>
-            <w:pPr>
-              <w:spacing w:after="0"/>
-            </w:pPr>
             <w:r>
-              <w:rPr>
-                <w:rFonts w:ascii="Arial" w:hAnsi="Arial"/>
-                <w:color w:val="000000"/>
-                <w:sz w:val="18"/>
-              </w:rPr>
-              <w:t>[Completar]</w:t>
+              <w:t>01-10-2026</w:t>
             </w:r>
           </w:p>
         </w:tc>
@@ -6971,16 +6075,8 @@
             </w:tcBorders>
           </w:tcPr>
           <w:p>
-            <w:pPr>
-              <w:spacing w:after="0"/>
-            </w:pPr>
             <w:r>
-              <w:rPr>
-                <w:rFonts w:ascii="Arial" w:hAnsi="Arial"/>
-                <w:color w:val="000000"/>
-                <w:sz w:val="18"/>
-              </w:rPr>
-              <w:t>[Secciones 4 a 6]</w:t>
+              <w:t>Secciones 4 a 6</w:t>
             </w:r>
           </w:p>
         </w:tc>
@@ -7006,16 +6102,8 @@
             </w:tcBorders>
           </w:tcPr>
           <w:p>
-            <w:pPr>
-              <w:spacing w:after="0"/>
-            </w:pPr>
             <w:r>
-              <w:rPr>
-                <w:rFonts w:ascii="Arial" w:hAnsi="Arial"/>
-                <w:color w:val="000000"/>
-                <w:sz w:val="18"/>
-              </w:rPr>
-              <w:t>Diseñar casos iniciales</w:t>
+              <w:t>Casos iniciales</w:t>
             </w:r>
           </w:p>
         </w:tc>
@@ -7039,16 +6127,8 @@
             </w:tcBorders>
           </w:tcPr>
           <w:p>
-            <w:pPr>
-              <w:spacing w:after="0"/>
-            </w:pPr>
             <w:r>
-              <w:rPr>
-                <w:rFonts w:ascii="Arial" w:hAnsi="Arial"/>
-                <w:color w:val="000000"/>
-                <w:sz w:val="18"/>
-              </w:rPr>
-              <w:t>[Completar]</w:t>
+              <w:t>Ambos</w:t>
             </w:r>
           </w:p>
         </w:tc>
@@ -7072,16 +6152,8 @@
             </w:tcBorders>
           </w:tcPr>
           <w:p>
-            <w:pPr>
-              <w:spacing w:after="0"/>
-            </w:pPr>
             <w:r>
-              <w:rPr>
-                <w:rFonts w:ascii="Arial" w:hAnsi="Arial"/>
-                <w:color w:val="000000"/>
-                <w:sz w:val="18"/>
-              </w:rPr>
-              <w:t>[Completar]</w:t>
+              <w:t>29-09-2026</w:t>
             </w:r>
           </w:p>
         </w:tc>
@@ -7105,16 +6177,8 @@
             </w:tcBorders>
           </w:tcPr>
           <w:p>
-            <w:pPr>
-              <w:spacing w:after="0"/>
-            </w:pPr>
             <w:r>
-              <w:rPr>
-                <w:rFonts w:ascii="Arial" w:hAnsi="Arial"/>
-                <w:color w:val="000000"/>
-                <w:sz w:val="18"/>
-              </w:rPr>
-              <w:t>[Sección 7]</w:t>
+              <w:t>Seccion 7 + Guia 2.2 (4 CP)</w:t>
             </w:r>
           </w:p>
         </w:tc>
@@ -7140,16 +6204,8 @@
             </w:tcBorders>
           </w:tcPr>
           <w:p>
-            <w:pPr>
-              <w:spacing w:after="0"/>
-            </w:pPr>
             <w:r>
-              <w:rPr>
-                <w:rFonts w:ascii="Arial" w:hAnsi="Arial"/>
-                <w:color w:val="000000"/>
-                <w:sz w:val="18"/>
-              </w:rPr>
-              <w:t>Revisar y consolidar entrega</w:t>
+              <w:t>Revisar y cerrar</w:t>
             </w:r>
           </w:p>
         </w:tc>
@@ -7173,16 +6229,8 @@
             </w:tcBorders>
           </w:tcPr>
           <w:p>
-            <w:pPr>
-              <w:spacing w:after="0"/>
-            </w:pPr>
             <w:r>
-              <w:rPr>
-                <w:rFonts w:ascii="Arial" w:hAnsi="Arial"/>
-                <w:color w:val="000000"/>
-                <w:sz w:val="18"/>
-              </w:rPr>
-              <w:t>[Completar]</w:t>
+              <w:t>Ambos</w:t>
             </w:r>
           </w:p>
         </w:tc>
@@ -7206,16 +6254,8 @@
             </w:tcBorders>
           </w:tcPr>
           <w:p>
-            <w:pPr>
-              <w:spacing w:after="0"/>
-            </w:pPr>
             <w:r>
-              <w:rPr>
-                <w:rFonts w:ascii="Arial" w:hAnsi="Arial"/>
-                <w:color w:val="000000"/>
-                <w:sz w:val="18"/>
-              </w:rPr>
-              <w:t>[Completar]</w:t>
+              <w:t>06-10-2026</w:t>
             </w:r>
           </w:p>
         </w:tc>
@@ -7239,16 +6279,8 @@
             </w:tcBorders>
           </w:tcPr>
           <w:p>
-            <w:pPr>
-              <w:spacing w:after="0"/>
-            </w:pPr>
             <w:r>
-              <w:rPr>
-                <w:rFonts w:ascii="Arial" w:hAnsi="Arial"/>
-                <w:color w:val="000000"/>
-                <w:sz w:val="18"/>
-              </w:rPr>
-              <w:t>[Versión final del documento]</w:t>
+              <w:t>Version final</w:t>
             </w:r>
           </w:p>
         </w:tc>
@@ -7273,7 +6305,7 @@
         <w:spacing w:after="80" w:line="259" w:lineRule="auto"/>
       </w:pPr>
       <w:r>
-        <w:t>[ ] El caso y sus componentes técnicos están identificados.</w:t>
+        <w:t>[x] El caso y sus componentes técnicos están identificados.</w:t>
       </w:r>
     </w:p>
     <w:p>
@@ -7281,7 +6313,7 @@
         <w:spacing w:after="80" w:line="259" w:lineRule="auto"/>
       </w:pPr>
       <w:r>
-        <w:t>[ ] El alcance indica claramente qué se probará y qué queda fuera.</w:t>
+        <w:t>[x] El alcance indica claramente qué se probará y qué queda fuera.</w:t>
       </w:r>
     </w:p>
     <w:p>
@@ -7289,7 +6321,7 @@
         <w:spacing w:after="80" w:line="259" w:lineRule="auto"/>
       </w:pPr>
       <w:r>
-        <w:t>[ ] Los requisitos tienen criterios de aceptación verificables.</w:t>
+        <w:t>[x] Los requisitos tienen criterios de aceptación verificables.</w:t>
       </w:r>
     </w:p>
     <w:p>
@@ -7297,7 +6329,7 @@
         <w:spacing w:after="80" w:line="259" w:lineRule="auto"/>
       </w:pPr>
       <w:r>
-        <w:t>[ ] La estrategia contempla calidad, seguridad y cumplimiento.</w:t>
+        <w:t>[x] La estrategia contempla calidad, seguridad y cumplimiento.</w:t>
       </w:r>
     </w:p>
     <w:p>
@@ -7305,7 +6337,7 @@
         <w:spacing w:after="80" w:line="259" w:lineRule="auto"/>
       </w:pPr>
       <w:r>
-        <w:t>[ ] Los riesgos están priorizados y vinculados a una prueba o control.</w:t>
+        <w:t>[x] Los riesgos están priorizados y vinculados a una prueba o control.</w:t>
       </w:r>
     </w:p>
     <w:p>
@@ -7313,7 +6345,7 @@
         <w:spacing w:after="80" w:line="259" w:lineRule="auto"/>
       </w:pPr>
       <w:r>
-        <w:t>[ ] Existen al menos cinco casos de prueba iniciales trazables.</w:t>
+        <w:t>[x] Existen al menos cinco casos de prueba iniciales trazables.</w:t>
       </w:r>
     </w:p>
     <w:p>
@@ -7321,7 +6353,7 @@
         <w:spacing w:after="80" w:line="259" w:lineRule="auto"/>
       </w:pPr>
       <w:r>
-        <w:t>[ ] El equipo incluyó evidencia del reconocimiento del sistema.</w:t>
+        <w:t>[x] El equipo incluyó evidencia del reconocimiento del sistema.</w:t>
       </w:r>
     </w:p>
     <w:p>

</xml_diff>